<commit_message>
structuur: Missende code in andere folder verplaatst
</commit_message>
<xml_diff>
--- a/Documentatie/4. programmeren en onderzoek/Onderzoek over API Get request en toepassen in JSON format.docx
+++ b/Documentatie/4. programmeren en onderzoek/Onderzoek over API Get request en toepassen in JSON format.docx
@@ -10,6 +10,7 @@
           <w:docPartUnique/>
         </w:docPartObj>
       </w:sdtPr>
+      <w:sdtEndPr/>
       <w:sdtContent>
         <w:p/>
         <w:p>
@@ -87,7 +88,7 @@
                             <w:txbxContent>
                               <w:p>
                                 <w:pPr>
-                                  <w:pStyle w:val="Geenafstand"/>
+                                  <w:pStyle w:val="NoSpacing"/>
                                   <w:spacing w:before="40" w:after="560" w:line="216" w:lineRule="auto"/>
                                   <w:rPr>
                                     <w:color w:val="156082" w:themeColor="accent1"/>
@@ -108,6 +109,7 @@
                                     <w:dataBinding w:prefixMappings="xmlns:ns0='http://purl.org/dc/elements/1.1/' xmlns:ns1='http://schemas.openxmlformats.org/package/2006/metadata/core-properties' " w:xpath="/ns1:coreProperties[1]/ns0:title[1]" w:storeItemID="{6C3C8BC8-F283-45AE-878A-BAB7291924A1}"/>
                                     <w:text/>
                                   </w:sdtPr>
+                                  <w:sdtEndPr/>
                                   <w:sdtContent>
                                     <w:r>
                                       <w:rPr>
@@ -134,10 +136,11 @@
                                   <w:dataBinding w:prefixMappings="xmlns:ns0='http://purl.org/dc/elements/1.1/' xmlns:ns1='http://schemas.openxmlformats.org/package/2006/metadata/core-properties' " w:xpath="/ns1:coreProperties[1]/ns0:subject[1]" w:storeItemID="{6C3C8BC8-F283-45AE-878A-BAB7291924A1}"/>
                                   <w:text/>
                                 </w:sdtPr>
+                                <w:sdtEndPr/>
                                 <w:sdtContent>
                                   <w:p>
                                     <w:pPr>
-                                      <w:pStyle w:val="Geenafstand"/>
+                                      <w:pStyle w:val="NoSpacing"/>
                                       <w:spacing w:before="40" w:after="40"/>
                                       <w:rPr>
                                         <w:caps/>
@@ -172,10 +175,11 @@
                                   <w:dataBinding w:prefixMappings="xmlns:ns0='http://purl.org/dc/elements/1.1/' xmlns:ns1='http://schemas.openxmlformats.org/package/2006/metadata/core-properties' " w:xpath="/ns1:coreProperties[1]/ns0:creator[1]" w:storeItemID="{6C3C8BC8-F283-45AE-878A-BAB7291924A1}"/>
                                   <w:text/>
                                 </w:sdtPr>
+                                <w:sdtEndPr/>
                                 <w:sdtContent>
                                   <w:p>
                                     <w:pPr>
-                                      <w:pStyle w:val="Geenafstand"/>
+                                      <w:pStyle w:val="NoSpacing"/>
                                       <w:spacing w:before="80" w:after="40"/>
                                       <w:rPr>
                                         <w:caps/>
@@ -216,7 +220,7 @@
                   </wp:anchor>
                 </w:drawing>
               </mc:Choice>
-              <mc:Fallback>
+              <mc:Fallback xmlns:pic="http://schemas.openxmlformats.org/drawingml/2006/picture" xmlns:a="http://schemas.openxmlformats.org/drawingml/2006/main">
                 <w:pict w14:anchorId="7B161498">
                   <v:shapetype id="_x0000_t202" coordsize="21600,21600" o:spt="202" path="m,l,21600r21600,l21600,xe" w14:anchorId="275660BC">
                     <v:stroke joinstyle="miter"/>
@@ -432,10 +436,11 @@
                                     <w:calendar w:val="gregorian"/>
                                   </w:date>
                                 </w:sdtPr>
+                                <w:sdtEndPr/>
                                 <w:sdtContent>
                                   <w:p>
                                     <w:pPr>
-                                      <w:pStyle w:val="Geenafstand"/>
+                                      <w:pStyle w:val="NoSpacing"/>
                                       <w:jc w:val="right"/>
                                       <w:rPr>
                                         <w:color w:val="FFFFFF" w:themeColor="background1"/>
@@ -474,7 +479,7 @@
                   </wp:anchor>
                 </w:drawing>
               </mc:Choice>
-              <mc:Fallback>
+              <mc:Fallback xmlns:pic="http://schemas.openxmlformats.org/drawingml/2006/picture" xmlns:a="http://schemas.openxmlformats.org/drawingml/2006/main">
                 <w:pict w14:anchorId="1B07DBCE">
                   <v:rect id="Rechthoek 132" style="position:absolute;margin-left:-4.4pt;margin-top:0;width:46.8pt;height:77.75pt;z-index:251659264;visibility:visible;mso-wrap-style:square;mso-width-percent:76;mso-height-percent:98;mso-top-percent:23;mso-wrap-distance-left:9pt;mso-wrap-distance-top:0;mso-wrap-distance-right:9pt;mso-wrap-distance-bottom:0;mso-position-horizontal:right;mso-position-horizontal-relative:margin;mso-position-vertical-relative:page;mso-width-percent:76;mso-height-percent:98;mso-top-percent:23;mso-width-relative:page;mso-height-relative:page;v-text-anchor:bottom" o:spid="_x0000_s1027" fillcolor="#156082 [3204]" stroked="f" strokeweight="1.5pt" w14:anchorId="54754214" o:gfxdata="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">
                     <o:lock v:ext="edit" aspectratio="t"/>
@@ -542,14 +547,31 @@
           <w:docPartGallery w:val="Table of Contents"/>
           <w:docPartUnique/>
         </w:docPartObj>
+        <w:rPr>
+          <w:rFonts w:ascii="Aptos" w:hAnsi="Aptos" w:eastAsia="Aptos" w:cs="Arial" w:asciiTheme="minorAscii" w:hAnsiTheme="minorAscii" w:eastAsiaTheme="minorAscii" w:cstheme="minorBidi"/>
+          <w:color w:val="auto"/>
+          <w:kern w:val="2"/>
+          <w:sz w:val="24"/>
+          <w:szCs w:val="24"/>
+          <w:lang w:eastAsia="en-US"/>
+          <w14:ligatures w14:val="standardContextual"/>
+        </w:rPr>
       </w:sdtPr>
+      <w:sdtEndPr>
+        <w:rPr>
+          <w:rFonts w:ascii="Aptos" w:hAnsi="Aptos" w:eastAsia="Aptos" w:cs="Arial" w:asciiTheme="minorAscii" w:hAnsiTheme="minorAscii" w:eastAsiaTheme="minorAscii" w:cstheme="minorBidi"/>
+          <w:color w:val="auto"/>
+          <w:sz w:val="24"/>
+          <w:szCs w:val="24"/>
+          <w:lang w:eastAsia="en-US"/>
+        </w:rPr>
+      </w:sdtEndPr>
       <w:sdtContent>
         <w:p>
           <w:pPr>
-            <w:pStyle w:val="Kopvaninhoudsopgave"/>
+            <w:pStyle w:val="TOCHeading"/>
           </w:pPr>
           <w:r>
-            <w:rPr/>
             <w:t>Inhoud</w:t>
           </w:r>
         </w:p>
@@ -567,7 +589,7 @@
             <w:fldChar w:fldCharType="begin"/>
           </w:r>
           <w:r>
-            <w:instrText xml:space="preserve">TOC \o "1-3" \z \u \h</w:instrText>
+            <w:instrText>TOC \o "1-3" \z \u \h</w:instrText>
           </w:r>
           <w:r>
             <w:fldChar w:fldCharType="separate"/>
@@ -586,7 +608,7 @@
               <w:fldChar w:fldCharType="begin"/>
             </w:r>
             <w:r>
-              <w:instrText xml:space="preserve">PAGEREF _Toc333537875 \h</w:instrText>
+              <w:instrText>PAGEREF _Toc333537875 \h</w:instrText>
             </w:r>
             <w:r>
               <w:fldChar w:fldCharType="separate"/>
@@ -626,7 +648,7 @@
               <w:fldChar w:fldCharType="begin"/>
             </w:r>
             <w:r>
-              <w:instrText xml:space="preserve">PAGEREF _Toc476803863 \h</w:instrText>
+              <w:instrText>PAGEREF _Toc476803863 \h</w:instrText>
             </w:r>
             <w:r>
               <w:fldChar w:fldCharType="separate"/>
@@ -666,7 +688,7 @@
               <w:fldChar w:fldCharType="begin"/>
             </w:r>
             <w:r>
-              <w:instrText xml:space="preserve">PAGEREF _Toc796058105 \h</w:instrText>
+              <w:instrText>PAGEREF _Toc796058105 \h</w:instrText>
             </w:r>
             <w:r>
               <w:fldChar w:fldCharType="separate"/>
@@ -706,7 +728,7 @@
               <w:fldChar w:fldCharType="begin"/>
             </w:r>
             <w:r>
-              <w:instrText xml:space="preserve">PAGEREF _Toc1170492604 \h</w:instrText>
+              <w:instrText>PAGEREF _Toc1170492604 \h</w:instrText>
             </w:r>
             <w:r>
               <w:fldChar w:fldCharType="separate"/>
@@ -746,7 +768,7 @@
               <w:fldChar w:fldCharType="begin"/>
             </w:r>
             <w:r>
-              <w:instrText xml:space="preserve">PAGEREF _Toc1350224886 \h</w:instrText>
+              <w:instrText>PAGEREF _Toc1350224886 \h</w:instrText>
             </w:r>
             <w:r>
               <w:fldChar w:fldCharType="separate"/>
@@ -774,14 +796,13 @@
     </w:p>
     <w:p>
       <w:pPr>
-        <w:pStyle w:val="Kop1"/>
+        <w:pStyle w:val="Heading1"/>
       </w:pPr>
-      <w:bookmarkStart w:name="_Toc333537875" w:id="615764466"/>
-      <w:r>
-        <w:rPr/>
+      <w:bookmarkStart w:name="_Toc333537875" w:id="0"/>
+      <w:r>
         <w:t>Inleiding</w:t>
       </w:r>
-      <w:bookmarkEnd w:id="615764466"/>
+      <w:bookmarkEnd w:id="0"/>
     </w:p>
     <w:p>
       <w:r>
@@ -837,13 +858,32 @@
     </w:p>
     <w:p>
       <w:r>
+        <w:rPr/>
         <w:t xml:space="preserve">Een browser weet niet </w:t>
       </w:r>
       <w:r>
-        <w:t xml:space="preserve">hoe het om moet gaan met tuples en weet de browser niet welke data bij welke kolomnamen het hoort. Om dit op te lossen, koppel ik de data eerst </w:t>
-      </w:r>
-      <w:r>
-        <w:t>handmatig aan de juiste kolomnamen door het om te zetten naar Python dictionasries.</w:t>
+        <w:rPr/>
+        <w:t xml:space="preserve">hoe het om moet gaan met </w:t>
+      </w:r>
+      <w:r>
+        <w:rPr/>
+        <w:t>tuples</w:t>
+      </w:r>
+      <w:r>
+        <w:rPr/>
+        <w:t xml:space="preserve"> en weet de browser niet welke data bij welke kolomnamen het hoort. Om dit op te lossen, koppel ik de data eerst </w:t>
+      </w:r>
+      <w:r>
+        <w:rPr/>
+        <w:t xml:space="preserve">handmatig aan de juiste kolomnamen door het om te zetten naar Python </w:t>
+      </w:r>
+      <w:r>
+        <w:rPr/>
+        <w:t>dictionaires</w:t>
+      </w:r>
+      <w:r>
+        <w:rPr/>
+        <w:t>.</w:t>
       </w:r>
     </w:p>
     <w:p>
@@ -863,21 +903,7 @@
             <w:rStyle w:val="Hyperlink"/>
             <w:lang w:val="en-US"/>
           </w:rPr>
-          <w:t>How to return json respon</w:t>
-        </w:r>
-        <w:r>
-          <w:rPr>
-            <w:rStyle w:val="Hyperlink"/>
-            <w:lang w:val="en-US"/>
-          </w:rPr>
-          <w:t>s</w:t>
-        </w:r>
-        <w:r>
-          <w:rPr>
-            <w:rStyle w:val="Hyperlink"/>
-            <w:lang w:val="en-US"/>
-          </w:rPr>
-          <w:t>e from flask api</w:t>
+          <w:t>How to return json response from flask api</w:t>
         </w:r>
       </w:hyperlink>
     </w:p>
@@ -896,19 +922,19 @@
     </w:p>
     <w:p>
       <w:pPr>
-        <w:pStyle w:val="Kop1"/>
+        <w:pStyle w:val="Heading1"/>
         <w:rPr>
           <w:lang w:val="en-US"/>
         </w:rPr>
       </w:pPr>
-      <w:bookmarkStart w:name="_Toc476803863" w:id="1212107103"/>
+      <w:bookmarkStart w:name="_Toc476803863" w:id="1"/>
       <w:r>
         <w:rPr>
           <w:lang w:val="en-US"/>
         </w:rPr>
         <w:t>Toepassen</w:t>
       </w:r>
-      <w:bookmarkEnd w:id="1212107103"/>
+      <w:bookmarkEnd w:id="1"/>
     </w:p>
     <w:p>
       <w:r>
@@ -920,18 +946,16 @@
     </w:p>
     <w:p>
       <w:pPr>
-        <w:pStyle w:val="Kop2"/>
+        <w:pStyle w:val="Heading2"/>
       </w:pPr>
-      <w:bookmarkStart w:name="_Toc796058105" w:id="1182221501"/>
-      <w:r>
-        <w:rPr/>
+      <w:bookmarkStart w:name="_Toc796058105" w:id="2"/>
+      <w:r>
         <w:t xml:space="preserve">Wat zal er gebeuren in de </w:t>
       </w:r>
       <w:r>
-        <w:rPr/>
         <w:t>route</w:t>
       </w:r>
-      <w:bookmarkEnd w:id="1182221501"/>
+      <w:bookmarkEnd w:id="2"/>
     </w:p>
     <w:p>
       <w:r>
@@ -964,17 +988,19 @@
     </w:p>
     <w:p>
       <w:pPr>
-        <w:pStyle w:val="Kop2"/>
+        <w:pStyle w:val="Heading2"/>
       </w:pPr>
-      <w:bookmarkStart w:name="_Toc1170492604" w:id="459071960"/>
-      <w:r>
-        <w:rPr/>
+      <w:bookmarkStart w:name="_Toc1170492604" w:id="3"/>
+      <w:r>
         <w:t>Code</w:t>
       </w:r>
-      <w:bookmarkEnd w:id="459071960"/>
-    </w:p>
-    <w:p>
-      <w:r>
+      <w:bookmarkEnd w:id="3"/>
+    </w:p>
+    <w:p>
+      <w:r>
+        <w:rPr>
+          <w:noProof/>
+        </w:rPr>
         <w:drawing>
           <wp:inline distT="0" distB="0" distL="0" distR="0" wp14:anchorId="00A8FA18" wp14:editId="0A35DF1B">
             <wp:extent cx="2524125" cy="3687663"/>
@@ -1043,6 +1069,9 @@
     </w:p>
     <w:p>
       <w:r>
+        <w:rPr>
+          <w:noProof/>
+        </w:rPr>
         <w:drawing>
           <wp:inline distT="0" distB="0" distL="0" distR="0" wp14:anchorId="6E168B3A" wp14:editId="5C1060C5">
             <wp:extent cx="2886075" cy="3167643"/>
@@ -1124,14 +1153,13 @@
     </w:p>
     <w:p>
       <w:pPr>
-        <w:pStyle w:val="Kop2"/>
+        <w:pStyle w:val="Heading2"/>
       </w:pPr>
-      <w:bookmarkStart w:name="_Toc1350224886" w:id="89118113"/>
-      <w:r>
-        <w:rPr/>
+      <w:bookmarkStart w:name="_Toc1350224886" w:id="4"/>
+      <w:r>
         <w:t>Testen</w:t>
       </w:r>
-      <w:bookmarkEnd w:id="89118113"/>
+      <w:bookmarkEnd w:id="4"/>
     </w:p>
     <w:p>
       <w:r>
@@ -1158,60 +1186,28 @@
     <w:p>
       <w:pPr>
         <w:rPr>
-          <w:i w:val="1"/>
-          <w:iCs w:val="1"/>
+          <w:i/>
+          <w:iCs/>
         </w:rPr>
       </w:pPr>
       <w:r>
         <w:rPr>
-          <w:i w:val="1"/>
-          <w:iCs w:val="1"/>
+          <w:i/>
+          <w:iCs/>
         </w:rPr>
-        <w:t>“</w:t>
-      </w:r>
+        <w:t>“Maak een simpel html pagina bouwen die simpel de return krijgt van een flask api”</w:t>
+      </w:r>
+    </w:p>
+    <w:p>
+      <w:r>
+        <w:t>Hierbij heb ik het volgende ontvangen</w:t>
+      </w:r>
+    </w:p>
+    <w:p>
       <w:r>
         <w:rPr>
-          <w:i w:val="1"/>
-          <w:iCs w:val="1"/>
+          <w:noProof/>
         </w:rPr>
-        <w:t xml:space="preserve">Maak een simpel html pagina bouwen die simpel de return krijgt van een </w:t>
-      </w:r>
-      <w:r>
-        <w:rPr>
-          <w:i w:val="1"/>
-          <w:iCs w:val="1"/>
-        </w:rPr>
-        <w:t>flask</w:t>
-      </w:r>
-      <w:r>
-        <w:rPr>
-          <w:i w:val="1"/>
-          <w:iCs w:val="1"/>
-        </w:rPr>
-        <w:t xml:space="preserve"> </w:t>
-      </w:r>
-      <w:r>
-        <w:rPr>
-          <w:i w:val="1"/>
-          <w:iCs w:val="1"/>
-        </w:rPr>
-        <w:t>api</w:t>
-      </w:r>
-      <w:r>
-        <w:rPr>
-          <w:i w:val="1"/>
-          <w:iCs w:val="1"/>
-        </w:rPr>
-        <w:t>”</w:t>
-      </w:r>
-    </w:p>
-    <w:p>
-      <w:r>
-        <w:t>Hierbij heb ik het volgende ontvangen</w:t>
-      </w:r>
-    </w:p>
-    <w:p>
-      <w:r>
         <w:drawing>
           <wp:inline distT="0" distB="0" distL="0" distR="0" wp14:anchorId="6D4E4D16" wp14:editId="5555AA03">
             <wp:extent cx="5760720" cy="5300980"/>
@@ -1275,6 +1271,9 @@
     </w:p>
     <w:p>
       <w:r>
+        <w:rPr>
+          <w:noProof/>
+        </w:rPr>
         <w:drawing>
           <wp:inline distT="0" distB="0" distL="0" distR="0" wp14:anchorId="39941587" wp14:editId="010AA3D4">
             <wp:extent cx="3543795" cy="1676634"/>
@@ -1319,6 +1318,9 @@
     </w:p>
     <w:p>
       <w:r>
+        <w:rPr>
+          <w:noProof/>
+        </w:rPr>
         <w:drawing>
           <wp:inline distT="0" distB="0" distL="0" distR="0" wp14:anchorId="4A547A89" wp14:editId="323E342D">
             <wp:extent cx="5760720" cy="570230"/>
@@ -1371,6 +1373,9 @@
     </w:p>
     <w:p>
       <w:r>
+        <w:rPr>
+          <w:noProof/>
+        </w:rPr>
         <w:drawing>
           <wp:inline distT="0" distB="0" distL="0" distR="0" wp14:anchorId="746745FF" wp14:editId="38F543B8">
             <wp:extent cx="2876951" cy="1438476"/>
@@ -1410,6 +1415,9 @@
     </w:p>
     <w:p>
       <w:r>
+        <w:rPr>
+          <w:noProof/>
+        </w:rPr>
         <w:drawing>
           <wp:inline distT="0" distB="0" distL="0" distR="0" wp14:anchorId="6283F78A" wp14:editId="7BBC545A">
             <wp:extent cx="4934639" cy="495369"/>
@@ -1523,6 +1531,9 @@
     </w:p>
     <w:p>
       <w:r>
+        <w:rPr>
+          <w:noProof/>
+        </w:rPr>
         <w:drawing>
           <wp:inline distT="0" distB="0" distL="0" distR="0" wp14:anchorId="4CAF2DA7" wp14:editId="7777506F">
             <wp:extent cx="3591426" cy="3572374"/>
@@ -1562,6 +1573,9 @@
     </w:p>
     <w:p>
       <w:r>
+        <w:rPr>
+          <w:noProof/>
+        </w:rPr>
         <w:drawing>
           <wp:inline distT="0" distB="0" distL="0" distR="0" wp14:anchorId="729E5C39" wp14:editId="67BDD03C">
             <wp:extent cx="5760720" cy="1280795"/>
@@ -1612,7 +1626,7 @@
 </file>
 
 <file path=word/styles.xml><?xml version="1.0" encoding="utf-8"?>
-<w:styles xmlns:wp14="http://schemas.microsoft.com/office/word/2010/wordprocessingDrawing" xmlns:mc="http://schemas.openxmlformats.org/markup-compatibility/2006" xmlns:r="http://schemas.openxmlformats.org/officeDocument/2006/relationships" xmlns:w="http://schemas.openxmlformats.org/wordprocessingml/2006/main" xmlns:w14="http://schemas.microsoft.com/office/word/2010/wordml" xmlns:w15="http://schemas.microsoft.com/office/word/2012/wordml" xmlns:w16cex="http://schemas.microsoft.com/office/word/2018/wordml/cex" xmlns:w16cid="http://schemas.microsoft.com/office/word/2016/wordml/cid" xmlns:w16="http://schemas.microsoft.com/office/word/2018/wordml" xmlns:w16du="http://schemas.microsoft.com/office/word/2023/wordml/word16du" xmlns:w16sdtdh="http://schemas.microsoft.com/office/word/2020/wordml/sdtdatahash" xmlns:w16sdtfl="http://schemas.microsoft.com/office/word/2024/wordml/sdtformatlock" xmlns:w16se="http://schemas.microsoft.com/office/word/2015/wordml/symex" mc:Ignorable="w14 w15 w16se w16cid w16 w16cex w16sdtdh w16sdtfl w16du wp14">
+<w:styles xmlns:mc="http://schemas.openxmlformats.org/markup-compatibility/2006" xmlns:r="http://schemas.openxmlformats.org/officeDocument/2006/relationships" xmlns:w="http://schemas.openxmlformats.org/wordprocessingml/2006/main" xmlns:w14="http://schemas.microsoft.com/office/word/2010/wordml" xmlns:w15="http://schemas.microsoft.com/office/word/2012/wordml" xmlns:w16cex="http://schemas.microsoft.com/office/word/2018/wordml/cex" xmlns:w16cid="http://schemas.microsoft.com/office/word/2016/wordml/cid" xmlns:w16="http://schemas.microsoft.com/office/word/2018/wordml" xmlns:w16du="http://schemas.microsoft.com/office/word/2023/wordml/word16du" xmlns:w16sdtdh="http://schemas.microsoft.com/office/word/2020/wordml/sdtdatahash" xmlns:w16sdtfl="http://schemas.microsoft.com/office/word/2024/wordml/sdtformatlock" xmlns:w16se="http://schemas.microsoft.com/office/word/2015/wordml/symex" mc:Ignorable="w14 w15 w16se w16cid w16 w16cex w16sdtdh w16sdtfl w16du">
   <w:docDefaults>
     <w:rPrDefault>
       <w:rPr>
@@ -2008,213 +2022,196 @@
     <w:lsdException w:name="Unresolved Mention" w:semiHidden="1" w:unhideWhenUsed="1"/>
     <w:lsdException w:name="Smart Link" w:semiHidden="1" w:unhideWhenUsed="1"/>
   </w:latentStyles>
-  <w:style w:type="paragraph" w:styleId="Standaard" w:default="1">
+  <w:style w:type="paragraph" w:styleId="Normal" w:default="1">
     <w:name w:val="Normal"/>
     <w:qFormat/>
   </w:style>
-  <w:style w:type="paragraph" w:styleId="Kop1">
+  <w:style w:type="paragraph" w:styleId="Heading1">
+    <w:name w:val="heading 1"/>
+    <w:link w:val="Heading1Char"/>
     <w:uiPriority w:val="9"/>
-    <w:name w:val="heading 1"/>
-    <w:basedOn w:val="Normal"/>
-    <w:next w:val="Normal"/>
-    <w:link w:val="Kop1Char"/>
     <w:qFormat/>
     <w:rsid w:val="41CA8222"/>
-    <w:rPr>
-      <w:rFonts w:ascii="Aptos Display" w:hAnsi="Aptos Display" w:eastAsia="" w:cs="" w:asciiTheme="majorAscii" w:hAnsiTheme="majorAscii" w:eastAsiaTheme="majorEastAsia" w:cstheme="majorBidi"/>
-      <w:color w:val="0F4761" w:themeColor="accent1" w:themeTint="FF" w:themeShade="BF"/>
-      <w:sz w:val="40"/>
-      <w:szCs w:val="40"/>
-    </w:rPr>
     <w:pPr>
-      <w:keepNext w:val="1"/>
-      <w:keepLines w:val="1"/>
+      <w:keepNext/>
+      <w:keepLines/>
       <w:spacing w:before="360" w:after="80"/>
       <w:outlineLvl w:val="0"/>
     </w:pPr>
-  </w:style>
-  <w:style w:type="paragraph" w:styleId="Kop2">
+    <w:rPr>
+      <w:rFonts w:asciiTheme="majorHAnsi" w:hAnsiTheme="majorHAnsi" w:eastAsiaTheme="majorEastAsia" w:cstheme="majorBidi"/>
+      <w:color w:val="0F4761" w:themeColor="accent1" w:themeShade="BF"/>
+      <w:sz w:val="40"/>
+      <w:szCs w:val="40"/>
+    </w:rPr>
+  </w:style>
+  <w:style w:type="paragraph" w:styleId="Heading2">
+    <w:name w:val="heading 2"/>
+    <w:link w:val="Heading2Char"/>
     <w:uiPriority w:val="9"/>
-    <w:name w:val="heading 2"/>
-    <w:basedOn w:val="Normal"/>
-    <w:next w:val="Normal"/>
     <w:unhideWhenUsed/>
-    <w:link w:val="Kop2Char"/>
     <w:qFormat/>
     <w:rsid w:val="41CA8222"/>
-    <w:rPr>
-      <w:rFonts w:ascii="Aptos Display" w:hAnsi="Aptos Display" w:eastAsia="" w:cs="" w:asciiTheme="majorAscii" w:hAnsiTheme="majorAscii" w:eastAsiaTheme="majorEastAsia" w:cstheme="majorBidi"/>
-      <w:color w:val="0F4761" w:themeColor="accent1" w:themeTint="FF" w:themeShade="BF"/>
-      <w:sz w:val="32"/>
-      <w:szCs w:val="32"/>
-    </w:rPr>
     <w:pPr>
-      <w:keepNext w:val="1"/>
-      <w:keepLines w:val="1"/>
+      <w:keepNext/>
+      <w:keepLines/>
       <w:spacing w:before="160" w:after="80"/>
       <w:outlineLvl w:val="1"/>
     </w:pPr>
-  </w:style>
-  <w:style w:type="paragraph" w:styleId="Kop3">
+    <w:rPr>
+      <w:rFonts w:asciiTheme="majorHAnsi" w:hAnsiTheme="majorHAnsi" w:eastAsiaTheme="majorEastAsia" w:cstheme="majorBidi"/>
+      <w:color w:val="0F4761" w:themeColor="accent1" w:themeShade="BF"/>
+      <w:sz w:val="32"/>
+      <w:szCs w:val="32"/>
+    </w:rPr>
+  </w:style>
+  <w:style w:type="paragraph" w:styleId="Heading3">
+    <w:name w:val="heading 3"/>
+    <w:link w:val="Heading3Char"/>
     <w:uiPriority w:val="9"/>
-    <w:name w:val="heading 3"/>
-    <w:basedOn w:val="Normal"/>
-    <w:next w:val="Normal"/>
     <w:unhideWhenUsed/>
-    <w:link w:val="Kop3Char"/>
     <w:qFormat/>
     <w:rsid w:val="41CA8222"/>
-    <w:rPr>
-      <w:rFonts w:eastAsia="" w:cs="" w:eastAsiaTheme="majorEastAsia" w:cstheme="majorBidi"/>
-      <w:color w:val="0F4761" w:themeColor="accent1" w:themeTint="FF" w:themeShade="BF"/>
-      <w:sz w:val="28"/>
-      <w:szCs w:val="28"/>
-    </w:rPr>
     <w:pPr>
-      <w:keepNext w:val="1"/>
-      <w:keepLines w:val="1"/>
+      <w:keepNext/>
+      <w:keepLines/>
       <w:spacing w:before="160" w:after="80"/>
       <w:outlineLvl w:val="2"/>
     </w:pPr>
-  </w:style>
-  <w:style w:type="paragraph" w:styleId="Kop4">
+    <w:rPr>
+      <w:rFonts w:eastAsiaTheme="majorEastAsia" w:cstheme="majorBidi"/>
+      <w:color w:val="0F4761" w:themeColor="accent1" w:themeShade="BF"/>
+      <w:sz w:val="28"/>
+      <w:szCs w:val="28"/>
+    </w:rPr>
+  </w:style>
+  <w:style w:type="paragraph" w:styleId="Heading4">
+    <w:name w:val="heading 4"/>
+    <w:link w:val="Heading4Char"/>
     <w:uiPriority w:val="9"/>
-    <w:name w:val="heading 4"/>
-    <w:basedOn w:val="Normal"/>
-    <w:next w:val="Normal"/>
     <w:semiHidden/>
     <w:unhideWhenUsed/>
-    <w:link w:val="Kop4Char"/>
     <w:qFormat/>
     <w:rsid w:val="41CA8222"/>
-    <w:rPr>
-      <w:rFonts w:eastAsia="" w:cs="" w:eastAsiaTheme="majorEastAsia" w:cstheme="majorBidi"/>
-      <w:i w:val="1"/>
-      <w:iCs w:val="1"/>
-      <w:color w:val="0F4761" w:themeColor="accent1" w:themeTint="FF" w:themeShade="BF"/>
-    </w:rPr>
     <w:pPr>
-      <w:keepNext w:val="1"/>
-      <w:keepLines w:val="1"/>
+      <w:keepNext/>
+      <w:keepLines/>
       <w:spacing w:before="80" w:after="40"/>
       <w:outlineLvl w:val="3"/>
     </w:pPr>
-  </w:style>
-  <w:style w:type="paragraph" w:styleId="Kop5">
+    <w:rPr>
+      <w:rFonts w:eastAsiaTheme="majorEastAsia" w:cstheme="majorBidi"/>
+      <w:i/>
+      <w:iCs/>
+      <w:color w:val="0F4761" w:themeColor="accent1" w:themeShade="BF"/>
+    </w:rPr>
+  </w:style>
+  <w:style w:type="paragraph" w:styleId="Heading5">
+    <w:name w:val="heading 5"/>
+    <w:link w:val="Heading5Char"/>
     <w:uiPriority w:val="9"/>
-    <w:name w:val="heading 5"/>
-    <w:basedOn w:val="Normal"/>
-    <w:next w:val="Normal"/>
     <w:semiHidden/>
     <w:unhideWhenUsed/>
-    <w:link w:val="Kop5Char"/>
     <w:qFormat/>
     <w:rsid w:val="41CA8222"/>
-    <w:rPr>
-      <w:rFonts w:eastAsia="" w:cs="" w:eastAsiaTheme="majorEastAsia" w:cstheme="majorBidi"/>
-      <w:color w:val="0F4761" w:themeColor="accent1" w:themeTint="FF" w:themeShade="BF"/>
-    </w:rPr>
     <w:pPr>
-      <w:keepNext w:val="1"/>
-      <w:keepLines w:val="1"/>
+      <w:keepNext/>
+      <w:keepLines/>
       <w:spacing w:before="80" w:after="40"/>
       <w:outlineLvl w:val="4"/>
     </w:pPr>
-  </w:style>
-  <w:style w:type="paragraph" w:styleId="Kop6">
+    <w:rPr>
+      <w:rFonts w:eastAsiaTheme="majorEastAsia" w:cstheme="majorBidi"/>
+      <w:color w:val="0F4761" w:themeColor="accent1" w:themeShade="BF"/>
+    </w:rPr>
+  </w:style>
+  <w:style w:type="paragraph" w:styleId="Heading6">
+    <w:name w:val="heading 6"/>
+    <w:link w:val="Heading6Char"/>
     <w:uiPriority w:val="9"/>
-    <w:name w:val="heading 6"/>
-    <w:basedOn w:val="Normal"/>
-    <w:next w:val="Normal"/>
     <w:semiHidden/>
     <w:unhideWhenUsed/>
-    <w:link w:val="Kop6Char"/>
     <w:qFormat/>
     <w:rsid w:val="41CA8222"/>
-    <w:rPr>
-      <w:rFonts w:eastAsia="" w:cs="" w:eastAsiaTheme="majorEastAsia" w:cstheme="majorBidi"/>
-      <w:i w:val="1"/>
-      <w:iCs w:val="1"/>
-      <w:color w:val="595959" w:themeColor="text1" w:themeTint="A6" w:themeShade="FF"/>
-    </w:rPr>
     <w:pPr>
-      <w:keepNext w:val="1"/>
-      <w:keepLines w:val="1"/>
+      <w:keepNext/>
+      <w:keepLines/>
       <w:spacing w:before="40" w:after="0"/>
       <w:outlineLvl w:val="5"/>
     </w:pPr>
-  </w:style>
-  <w:style w:type="paragraph" w:styleId="Kop7">
+    <w:rPr>
+      <w:rFonts w:eastAsiaTheme="majorEastAsia" w:cstheme="majorBidi"/>
+      <w:i/>
+      <w:iCs/>
+      <w:color w:val="595959" w:themeColor="text1" w:themeTint="A6"/>
+    </w:rPr>
+  </w:style>
+  <w:style w:type="paragraph" w:styleId="Heading7">
+    <w:name w:val="heading 7"/>
+    <w:link w:val="Heading7Char"/>
     <w:uiPriority w:val="9"/>
-    <w:name w:val="heading 7"/>
-    <w:basedOn w:val="Normal"/>
-    <w:next w:val="Normal"/>
     <w:semiHidden/>
     <w:unhideWhenUsed/>
-    <w:link w:val="Kop7Char"/>
     <w:qFormat/>
     <w:rsid w:val="41CA8222"/>
-    <w:rPr>
-      <w:rFonts w:eastAsia="" w:cs="" w:eastAsiaTheme="majorEastAsia" w:cstheme="majorBidi"/>
-      <w:color w:val="595959" w:themeColor="text1" w:themeTint="A6" w:themeShade="FF"/>
-    </w:rPr>
     <w:pPr>
-      <w:keepNext w:val="1"/>
-      <w:keepLines w:val="1"/>
+      <w:keepNext/>
+      <w:keepLines/>
       <w:spacing w:before="40" w:after="0"/>
       <w:outlineLvl w:val="6"/>
     </w:pPr>
-  </w:style>
-  <w:style w:type="paragraph" w:styleId="Kop8">
+    <w:rPr>
+      <w:rFonts w:eastAsiaTheme="majorEastAsia" w:cstheme="majorBidi"/>
+      <w:color w:val="595959" w:themeColor="text1" w:themeTint="A6"/>
+    </w:rPr>
+  </w:style>
+  <w:style w:type="paragraph" w:styleId="Heading8">
+    <w:name w:val="heading 8"/>
+    <w:link w:val="Heading8Char"/>
     <w:uiPriority w:val="9"/>
-    <w:name w:val="heading 8"/>
-    <w:basedOn w:val="Normal"/>
-    <w:next w:val="Normal"/>
     <w:semiHidden/>
     <w:unhideWhenUsed/>
-    <w:link w:val="Kop8Char"/>
     <w:qFormat/>
     <w:rsid w:val="41CA8222"/>
-    <w:rPr>
-      <w:rFonts w:eastAsia="" w:cs="" w:eastAsiaTheme="majorEastAsia" w:cstheme="majorBidi"/>
-      <w:i w:val="1"/>
-      <w:iCs w:val="1"/>
-      <w:color w:val="272727"/>
-    </w:rPr>
     <w:pPr>
-      <w:keepNext w:val="1"/>
-      <w:keepLines w:val="1"/>
+      <w:keepNext/>
+      <w:keepLines/>
       <w:spacing w:after="0"/>
       <w:outlineLvl w:val="7"/>
     </w:pPr>
-  </w:style>
-  <w:style w:type="paragraph" w:styleId="Kop9">
+    <w:rPr>
+      <w:rFonts w:eastAsiaTheme="majorEastAsia" w:cstheme="majorBidi"/>
+      <w:i/>
+      <w:iCs/>
+      <w:color w:val="272727"/>
+    </w:rPr>
+  </w:style>
+  <w:style w:type="paragraph" w:styleId="Heading9">
+    <w:name w:val="heading 9"/>
+    <w:link w:val="Heading9Char"/>
     <w:uiPriority w:val="9"/>
-    <w:name w:val="heading 9"/>
-    <w:basedOn w:val="Normal"/>
-    <w:next w:val="Normal"/>
     <w:semiHidden/>
     <w:unhideWhenUsed/>
-    <w:link w:val="Kop9Char"/>
     <w:qFormat/>
     <w:rsid w:val="41CA8222"/>
-    <w:rPr>
-      <w:rFonts w:eastAsia="" w:cs="" w:eastAsiaTheme="majorEastAsia" w:cstheme="majorBidi"/>
-      <w:color w:val="272727"/>
-    </w:rPr>
     <w:pPr>
-      <w:keepNext w:val="1"/>
-      <w:keepLines w:val="1"/>
+      <w:keepNext/>
+      <w:keepLines/>
       <w:spacing w:after="0"/>
       <w:outlineLvl w:val="8"/>
     </w:pPr>
-  </w:style>
-  <w:style w:type="character" w:styleId="Standaardalinea-lettertype" w:default="1">
+    <w:rPr>
+      <w:rFonts w:eastAsiaTheme="majorEastAsia" w:cstheme="majorBidi"/>
+      <w:color w:val="272727"/>
+    </w:rPr>
+  </w:style>
+  <w:style w:type="character" w:styleId="DefaultParagraphFont" w:default="1">
     <w:name w:val="Default Paragraph Font"/>
     <w:uiPriority w:val="1"/>
+    <w:semiHidden/>
     <w:unhideWhenUsed/>
   </w:style>
-  <w:style w:type="table" w:styleId="Standaardtabel" w:default="1">
+  <w:style w:type="table" w:styleId="TableNormal" w:default="1">
     <w:name w:val="Normal Table"/>
     <w:uiPriority w:val="99"/>
     <w:semiHidden/>
@@ -2229,16 +2226,16 @@
       </w:tblCellMar>
     </w:tblPr>
   </w:style>
-  <w:style w:type="numbering" w:styleId="Geenlijst" w:default="1">
+  <w:style w:type="numbering" w:styleId="NoList" w:default="1">
     <w:name w:val="No List"/>
     <w:uiPriority w:val="99"/>
     <w:semiHidden/>
     <w:unhideWhenUsed/>
   </w:style>
-  <w:style w:type="character" w:styleId="Kop1Char" w:customStyle="1">
-    <w:name w:val="Kop 1 Char"/>
-    <w:basedOn w:val="Standaardalinea-lettertype"/>
-    <w:link w:val="Kop1"/>
+  <w:style w:type="character" w:styleId="Heading1Char" w:customStyle="1">
+    <w:name w:val="Heading 1 Char"/>
+    <w:basedOn w:val="DefaultParagraphFont"/>
+    <w:link w:val="Heading1"/>
     <w:uiPriority w:val="9"/>
     <w:rsid w:val="00D35E7C"/>
     <w:rPr>
@@ -2248,10 +2245,10 @@
       <w:szCs w:val="40"/>
     </w:rPr>
   </w:style>
-  <w:style w:type="character" w:styleId="Kop2Char" w:customStyle="1">
-    <w:name w:val="Kop 2 Char"/>
-    <w:basedOn w:val="Standaardalinea-lettertype"/>
-    <w:link w:val="Kop2"/>
+  <w:style w:type="character" w:styleId="Heading2Char" w:customStyle="1">
+    <w:name w:val="Heading 2 Char"/>
+    <w:basedOn w:val="DefaultParagraphFont"/>
+    <w:link w:val="Heading2"/>
     <w:uiPriority w:val="9"/>
     <w:rsid w:val="00D35E7C"/>
     <w:rPr>
@@ -2261,10 +2258,10 @@
       <w:szCs w:val="32"/>
     </w:rPr>
   </w:style>
-  <w:style w:type="character" w:styleId="Kop3Char" w:customStyle="1">
-    <w:name w:val="Kop 3 Char"/>
-    <w:basedOn w:val="Standaardalinea-lettertype"/>
-    <w:link w:val="Kop3"/>
+  <w:style w:type="character" w:styleId="Heading3Char" w:customStyle="1">
+    <w:name w:val="Heading 3 Char"/>
+    <w:basedOn w:val="DefaultParagraphFont"/>
+    <w:link w:val="Heading3"/>
     <w:uiPriority w:val="9"/>
     <w:rsid w:val="00D35E7C"/>
     <w:rPr>
@@ -2274,10 +2271,10 @@
       <w:szCs w:val="28"/>
     </w:rPr>
   </w:style>
-  <w:style w:type="character" w:styleId="Kop4Char" w:customStyle="1">
-    <w:name w:val="Kop 4 Char"/>
-    <w:basedOn w:val="Standaardalinea-lettertype"/>
-    <w:link w:val="Kop4"/>
+  <w:style w:type="character" w:styleId="Heading4Char" w:customStyle="1">
+    <w:name w:val="Heading 4 Char"/>
+    <w:basedOn w:val="DefaultParagraphFont"/>
+    <w:link w:val="Heading4"/>
     <w:uiPriority w:val="9"/>
     <w:semiHidden/>
     <w:rsid w:val="00D35E7C"/>
@@ -2288,10 +2285,10 @@
       <w:color w:val="0F4761" w:themeColor="accent1" w:themeShade="BF"/>
     </w:rPr>
   </w:style>
-  <w:style w:type="character" w:styleId="Kop5Char" w:customStyle="1">
-    <w:name w:val="Kop 5 Char"/>
-    <w:basedOn w:val="Standaardalinea-lettertype"/>
-    <w:link w:val="Kop5"/>
+  <w:style w:type="character" w:styleId="Heading5Char" w:customStyle="1">
+    <w:name w:val="Heading 5 Char"/>
+    <w:basedOn w:val="DefaultParagraphFont"/>
+    <w:link w:val="Heading5"/>
     <w:uiPriority w:val="9"/>
     <w:semiHidden/>
     <w:rsid w:val="00D35E7C"/>
@@ -2300,10 +2297,10 @@
       <w:color w:val="0F4761" w:themeColor="accent1" w:themeShade="BF"/>
     </w:rPr>
   </w:style>
-  <w:style w:type="character" w:styleId="Kop6Char" w:customStyle="1">
-    <w:name w:val="Kop 6 Char"/>
-    <w:basedOn w:val="Standaardalinea-lettertype"/>
-    <w:link w:val="Kop6"/>
+  <w:style w:type="character" w:styleId="Heading6Char" w:customStyle="1">
+    <w:name w:val="Heading 6 Char"/>
+    <w:basedOn w:val="DefaultParagraphFont"/>
+    <w:link w:val="Heading6"/>
     <w:uiPriority w:val="9"/>
     <w:semiHidden/>
     <w:rsid w:val="00D35E7C"/>
@@ -2314,10 +2311,10 @@
       <w:color w:val="595959" w:themeColor="text1" w:themeTint="A6"/>
     </w:rPr>
   </w:style>
-  <w:style w:type="character" w:styleId="Kop7Char" w:customStyle="1">
-    <w:name w:val="Kop 7 Char"/>
-    <w:basedOn w:val="Standaardalinea-lettertype"/>
-    <w:link w:val="Kop7"/>
+  <w:style w:type="character" w:styleId="Heading7Char" w:customStyle="1">
+    <w:name w:val="Heading 7 Char"/>
+    <w:basedOn w:val="DefaultParagraphFont"/>
+    <w:link w:val="Heading7"/>
     <w:uiPriority w:val="9"/>
     <w:semiHidden/>
     <w:rsid w:val="00D35E7C"/>
@@ -2326,10 +2323,10 @@
       <w:color w:val="595959" w:themeColor="text1" w:themeTint="A6"/>
     </w:rPr>
   </w:style>
-  <w:style w:type="character" w:styleId="Kop8Char" w:customStyle="1">
-    <w:name w:val="Kop 8 Char"/>
-    <w:basedOn w:val="Standaardalinea-lettertype"/>
-    <w:link w:val="Kop8"/>
+  <w:style w:type="character" w:styleId="Heading8Char" w:customStyle="1">
+    <w:name w:val="Heading 8 Char"/>
+    <w:basedOn w:val="DefaultParagraphFont"/>
+    <w:link w:val="Heading8"/>
     <w:uiPriority w:val="9"/>
     <w:semiHidden/>
     <w:rsid w:val="00D35E7C"/>
@@ -2340,10 +2337,10 @@
       <w:color w:val="272727" w:themeColor="text1" w:themeTint="D8"/>
     </w:rPr>
   </w:style>
-  <w:style w:type="character" w:styleId="Kop9Char" w:customStyle="1">
-    <w:name w:val="Kop 9 Char"/>
-    <w:basedOn w:val="Standaardalinea-lettertype"/>
-    <w:link w:val="Kop9"/>
+  <w:style w:type="character" w:styleId="Heading9Char" w:customStyle="1">
+    <w:name w:val="Heading 9 Char"/>
+    <w:basedOn w:val="DefaultParagraphFont"/>
+    <w:link w:val="Heading9"/>
     <w:uiPriority w:val="9"/>
     <w:semiHidden/>
     <w:rsid w:val="00D35E7C"/>
@@ -2352,28 +2349,26 @@
       <w:color w:val="272727" w:themeColor="text1" w:themeTint="D8"/>
     </w:rPr>
   </w:style>
-  <w:style w:type="paragraph" w:styleId="Titel">
+  <w:style w:type="paragraph" w:styleId="Title">
+    <w:name w:val="Title"/>
+    <w:link w:val="TitleChar"/>
     <w:uiPriority w:val="10"/>
-    <w:name w:val="Title"/>
-    <w:basedOn w:val="Normal"/>
-    <w:next w:val="Normal"/>
-    <w:link w:val="TitelChar"/>
     <w:qFormat/>
     <w:rsid w:val="41CA8222"/>
-    <w:rPr>
-      <w:rFonts w:ascii="Aptos Display" w:hAnsi="Aptos Display" w:eastAsia="" w:cs="" w:asciiTheme="majorAscii" w:hAnsiTheme="majorAscii" w:eastAsiaTheme="majorEastAsia" w:cstheme="majorBidi"/>
-      <w:sz w:val="56"/>
-      <w:szCs w:val="56"/>
-    </w:rPr>
     <w:pPr>
       <w:spacing w:after="80" w:line="240" w:lineRule="auto"/>
       <w:contextualSpacing/>
     </w:pPr>
-  </w:style>
-  <w:style w:type="character" w:styleId="TitelChar" w:customStyle="1">
-    <w:name w:val="Titel Char"/>
-    <w:basedOn w:val="Standaardalinea-lettertype"/>
-    <w:link w:val="Titel"/>
+    <w:rPr>
+      <w:rFonts w:asciiTheme="majorHAnsi" w:hAnsiTheme="majorHAnsi" w:eastAsiaTheme="majorEastAsia" w:cstheme="majorBidi"/>
+      <w:sz w:val="56"/>
+      <w:szCs w:val="56"/>
+    </w:rPr>
+  </w:style>
+  <w:style w:type="character" w:styleId="TitleChar" w:customStyle="1">
+    <w:name w:val="Title Char"/>
+    <w:basedOn w:val="DefaultParagraphFont"/>
+    <w:link w:val="Title"/>
     <w:uiPriority w:val="10"/>
     <w:rsid w:val="00D35E7C"/>
     <w:rPr>
@@ -2384,25 +2379,23 @@
       <w:szCs w:val="56"/>
     </w:rPr>
   </w:style>
-  <w:style w:type="paragraph" w:styleId="Ondertitel">
+  <w:style w:type="paragraph" w:styleId="Subtitle">
+    <w:name w:val="Subtitle"/>
+    <w:link w:val="SubtitleChar"/>
     <w:uiPriority w:val="11"/>
-    <w:name w:val="Subtitle"/>
-    <w:basedOn w:val="Normal"/>
-    <w:next w:val="Normal"/>
-    <w:link w:val="OndertitelChar"/>
     <w:qFormat/>
     <w:rsid w:val="41CA8222"/>
     <w:rPr>
-      <w:rFonts w:eastAsia="" w:cs="" w:eastAsiaTheme="majorEastAsia" w:cstheme="majorBidi"/>
-      <w:color w:val="595959" w:themeColor="text1" w:themeTint="A6" w:themeShade="FF"/>
+      <w:rFonts w:eastAsiaTheme="majorEastAsia" w:cstheme="majorBidi"/>
+      <w:color w:val="595959" w:themeColor="text1" w:themeTint="A6"/>
       <w:sz w:val="28"/>
       <w:szCs w:val="28"/>
     </w:rPr>
   </w:style>
-  <w:style w:type="character" w:styleId="OndertitelChar" w:customStyle="1">
-    <w:name w:val="Ondertitel Char"/>
-    <w:basedOn w:val="Standaardalinea-lettertype"/>
-    <w:link w:val="Ondertitel"/>
+  <w:style w:type="character" w:styleId="SubtitleChar" w:customStyle="1">
+    <w:name w:val="Subtitle Char"/>
+    <w:basedOn w:val="DefaultParagraphFont"/>
+    <w:link w:val="Subtitle"/>
     <w:uiPriority w:val="11"/>
     <w:rsid w:val="00D35E7C"/>
     <w:rPr>
@@ -2413,51 +2406,47 @@
       <w:szCs w:val="28"/>
     </w:rPr>
   </w:style>
-  <w:style w:type="paragraph" w:styleId="Citaat">
+  <w:style w:type="paragraph" w:styleId="Quote">
+    <w:name w:val="Quote"/>
+    <w:link w:val="QuoteChar"/>
     <w:uiPriority w:val="29"/>
-    <w:name w:val="Quote"/>
-    <w:basedOn w:val="Normal"/>
-    <w:next w:val="Normal"/>
-    <w:link w:val="CitaatChar"/>
     <w:qFormat/>
     <w:rsid w:val="41CA8222"/>
-    <w:rPr>
-      <w:i w:val="1"/>
-      <w:iCs w:val="1"/>
-      <w:color w:val="404040" w:themeColor="text1" w:themeTint="BF" w:themeShade="FF"/>
-    </w:rPr>
     <w:pPr>
       <w:spacing w:before="160"/>
       <w:jc w:val="center"/>
     </w:pPr>
-  </w:style>
-  <w:style w:type="character" w:styleId="CitaatChar" w:customStyle="1">
-    <w:name w:val="Citaat Char"/>
-    <w:basedOn w:val="Standaardalinea-lettertype"/>
-    <w:link w:val="Citaat"/>
-    <w:uiPriority w:val="29"/>
-    <w:rsid w:val="00D35E7C"/>
     <w:rPr>
       <w:i/>
       <w:iCs/>
       <w:color w:val="404040" w:themeColor="text1" w:themeTint="BF"/>
     </w:rPr>
   </w:style>
-  <w:style w:type="paragraph" w:styleId="Lijstalinea">
+  <w:style w:type="character" w:styleId="QuoteChar" w:customStyle="1">
+    <w:name w:val="Quote Char"/>
+    <w:basedOn w:val="DefaultParagraphFont"/>
+    <w:link w:val="Quote"/>
+    <w:uiPriority w:val="29"/>
+    <w:rsid w:val="00D35E7C"/>
+    <w:rPr>
+      <w:i/>
+      <w:iCs/>
+      <w:color w:val="404040" w:themeColor="text1" w:themeTint="BF"/>
+    </w:rPr>
+  </w:style>
+  <w:style w:type="paragraph" w:styleId="ListParagraph">
+    <w:name w:val="List Paragraph"/>
     <w:uiPriority w:val="34"/>
-    <w:name w:val="List Paragraph"/>
-    <w:basedOn w:val="Normal"/>
     <w:qFormat/>
     <w:rsid w:val="41CA8222"/>
     <w:pPr>
-      <w:spacing/>
       <w:ind w:left="720"/>
       <w:contextualSpacing/>
     </w:pPr>
   </w:style>
-  <w:style w:type="character" w:styleId="Intensievebenadrukking">
+  <w:style w:type="character" w:styleId="IntenseEmphasis">
     <w:name w:val="Intense Emphasis"/>
-    <w:basedOn w:val="Standaardalinea-lettertype"/>
+    <w:basedOn w:val="DefaultParagraphFont"/>
     <w:uiPriority w:val="21"/>
     <w:qFormat/>
     <w:rsid w:val="00D35E7C"/>
@@ -2467,19 +2456,12 @@
       <w:color w:val="0F4761" w:themeColor="accent1" w:themeShade="BF"/>
     </w:rPr>
   </w:style>
-  <w:style w:type="paragraph" w:styleId="Duidelijkcitaat">
+  <w:style w:type="paragraph" w:styleId="IntenseQuote">
+    <w:name w:val="Intense Quote"/>
+    <w:link w:val="IntenseQuoteChar"/>
     <w:uiPriority w:val="30"/>
-    <w:name w:val="Intense Quote"/>
-    <w:basedOn w:val="Normal"/>
-    <w:next w:val="Normal"/>
-    <w:link w:val="DuidelijkcitaatChar"/>
     <w:qFormat/>
     <w:rsid w:val="41CA8222"/>
-    <w:rPr>
-      <w:i w:val="1"/>
-      <w:iCs w:val="1"/>
-      <w:color w:val="0F4761" w:themeColor="accent1" w:themeTint="FF" w:themeShade="BF"/>
-    </w:rPr>
     <w:pPr>
       <w:pBdr>
         <w:top w:val="single" w:color="0F4761" w:themeColor="accent1" w:themeShade="BF" w:sz="4" w:space="10"/>
@@ -2489,22 +2471,27 @@
       <w:ind w:left="864" w:right="864"/>
       <w:jc w:val="center"/>
     </w:pPr>
-  </w:style>
-  <w:style w:type="character" w:styleId="DuidelijkcitaatChar" w:customStyle="1">
-    <w:name w:val="Duidelijk citaat Char"/>
-    <w:basedOn w:val="Standaardalinea-lettertype"/>
-    <w:link w:val="Duidelijkcitaat"/>
-    <w:uiPriority w:val="30"/>
-    <w:rsid w:val="00D35E7C"/>
     <w:rPr>
       <w:i/>
       <w:iCs/>
       <w:color w:val="0F4761" w:themeColor="accent1" w:themeShade="BF"/>
     </w:rPr>
   </w:style>
-  <w:style w:type="character" w:styleId="Intensieveverwijzing">
+  <w:style w:type="character" w:styleId="IntenseQuoteChar" w:customStyle="1">
+    <w:name w:val="Intense Quote Char"/>
+    <w:basedOn w:val="DefaultParagraphFont"/>
+    <w:link w:val="IntenseQuote"/>
+    <w:uiPriority w:val="30"/>
+    <w:rsid w:val="00D35E7C"/>
+    <w:rPr>
+      <w:i/>
+      <w:iCs/>
+      <w:color w:val="0F4761" w:themeColor="accent1" w:themeShade="BF"/>
+    </w:rPr>
+  </w:style>
+  <w:style w:type="character" w:styleId="IntenseReference">
     <w:name w:val="Intense Reference"/>
-    <w:basedOn w:val="Standaardalinea-lettertype"/>
+    <w:basedOn w:val="DefaultParagraphFont"/>
     <w:uiPriority w:val="32"/>
     <w:qFormat/>
     <w:rsid w:val="00D35E7C"/>
@@ -2516,9 +2503,9 @@
       <w:spacing w:val="5"/>
     </w:rPr>
   </w:style>
-  <w:style w:type="paragraph" w:styleId="Geenafstand">
+  <w:style w:type="paragraph" w:styleId="NoSpacing">
     <w:name w:val="No Spacing"/>
-    <w:link w:val="GeenafstandChar"/>
+    <w:link w:val="NoSpacingChar"/>
     <w:uiPriority w:val="1"/>
     <w:qFormat/>
     <w:rsid w:val="00AB5F21"/>
@@ -2534,10 +2521,10 @@
       <w14:ligatures w14:val="none"/>
     </w:rPr>
   </w:style>
-  <w:style w:type="character" w:styleId="GeenafstandChar" w:customStyle="1">
-    <w:name w:val="Geen afstand Char"/>
-    <w:basedOn w:val="Standaardalinea-lettertype"/>
-    <w:link w:val="Geenafstand"/>
+  <w:style w:type="character" w:styleId="NoSpacingChar" w:customStyle="1">
+    <w:name w:val="No Spacing Char"/>
+    <w:basedOn w:val="DefaultParagraphFont"/>
+    <w:link w:val="NoSpacing"/>
     <w:uiPriority w:val="1"/>
     <w:rsid w:val="00AB5F21"/>
     <w:rPr>
@@ -2549,10 +2536,10 @@
       <w14:ligatures w14:val="none"/>
     </w:rPr>
   </w:style>
-  <w:style w:type="paragraph" w:styleId="Kopvaninhoudsopgave">
+  <w:style w:type="paragraph" w:styleId="TOCHeading">
     <w:name w:val="TOC Heading"/>
-    <w:basedOn w:val="Kop1"/>
-    <w:next w:val="Standaard"/>
+    <w:basedOn w:val="Heading1"/>
+    <w:next w:val="Normal"/>
     <w:uiPriority w:val="39"/>
     <w:unhideWhenUsed/>
     <w:qFormat/>
@@ -2571,7 +2558,7 @@
   </w:style>
   <w:style w:type="character" w:styleId="Hyperlink">
     <w:name w:val="Hyperlink"/>
-    <w:basedOn w:val="Standaardalinea-lettertype"/>
+    <w:basedOn w:val="DefaultParagraphFont"/>
     <w:uiPriority w:val="99"/>
     <w:unhideWhenUsed/>
     <w:rsid w:val="00E04E60"/>
@@ -2580,9 +2567,9 @@
       <w:u w:val="single"/>
     </w:rPr>
   </w:style>
-  <w:style w:type="character" w:styleId="Onopgelostemelding">
+  <w:style w:type="character" w:styleId="UnresolvedMention">
     <w:name w:val="Unresolved Mention"/>
-    <w:basedOn w:val="Standaardalinea-lettertype"/>
+    <w:basedOn w:val="DefaultParagraphFont"/>
     <w:uiPriority w:val="99"/>
     <w:semiHidden/>
     <w:unhideWhenUsed/>
@@ -2592,9 +2579,9 @@
       <w:shd w:val="clear" w:color="auto" w:fill="E1DFDD"/>
     </w:rPr>
   </w:style>
-  <w:style w:type="character" w:styleId="GevolgdeHyperlink">
+  <w:style w:type="character" w:styleId="FollowedHyperlink">
     <w:name w:val="FollowedHyperlink"/>
-    <w:basedOn w:val="Standaardalinea-lettertype"/>
+    <w:basedOn w:val="DefaultParagraphFont"/>
     <w:uiPriority w:val="99"/>
     <w:semiHidden/>
     <w:unhideWhenUsed/>
@@ -2605,10 +2592,8 @@
     </w:rPr>
   </w:style>
   <w:style w:type="paragraph" w:styleId="TOC1">
+    <w:name w:val="toc 1"/>
     <w:uiPriority w:val="39"/>
-    <w:name w:val="toc 1"/>
-    <w:basedOn w:val="Normal"/>
-    <w:next w:val="Normal"/>
     <w:unhideWhenUsed/>
     <w:rsid w:val="41CA8222"/>
     <w:pPr>
@@ -2616,10 +2601,8 @@
     </w:pPr>
   </w:style>
   <w:style w:type="paragraph" w:styleId="TOC2">
+    <w:name w:val="toc 2"/>
     <w:uiPriority w:val="39"/>
-    <w:name w:val="toc 2"/>
-    <w:basedOn w:val="Normal"/>
-    <w:next w:val="Normal"/>
     <w:unhideWhenUsed/>
     <w:rsid w:val="41CA8222"/>
     <w:pPr>

</xml_diff>